<commit_message>
Renombre del proyecto: Fluir con-ciencia, gotas de vida
</commit_message>
<xml_diff>
--- a/documento/documento_postulacion.docx
+++ b/documento/documento_postulacion.docx
@@ -40,7 +40,7 @@
           <w:spacing w:val="0"/>
           <w:color w:val="0F4B53"/>
         </w:rPr>
-        <w:t xml:space="preserve">Agua Viva · Experiencia interactiva del agua en el Maule</w:t>
+        <w:t xml:space="preserve">Fluir con-ciencia, gotas de vida: Experiencias Hídricas en el Maule</w:t>
       </w:r>
       <w:r>
         <w:rPr>
@@ -142,7 +142,7 @@
           <w:spacing w:val="0"/>
           <w:color w:val="0F272E"/>
         </w:rPr>
-        <w:t xml:space="preserve">Agua Viva</w:t>
+        <w:t xml:space="preserve">Fluir con-ciencia, gotas de vida</w:t>
       </w:r>
       <w:r>
         <w:rPr>
@@ -5432,7 +5432,7 @@
           <w:spacing w:val="0"/>
           <w:color w:val="0F272E"/>
         </w:rPr>
-        <w:t xml:space="preserve">Agua Viva · Experiencia interactiva del agua en el Maule</w:t>
+        <w:t xml:space="preserve">Fluir con-ciencia, gotas de vida: Experiencias Hídricas en el Maule</w:t>
       </w:r>
       <w:r>
         <w:rPr>

</xml_diff>